<commit_message>
Methods: subsection on AI-assisted tools (COPE / Preprints.org policy)
Preprints.org asks for AI use to be documented in the Methods section.
New subsection 'Use of AI-assisted tools' (EN) / 'Uso de ferramentas de
inteligencia artificial' (PT) at the end of Methods; the declaration at
the end stays. Preprints.org Word file, TechRxiv PDF, preprint PDF and
submission guide regenerated.

Co-Authored-By: Claude Opus 5.5 <noreply@anthropic.com>
Claude-Session: https://claude.ai/code/session_01FRPQ8QhZjRsnKGYPYZP4fe
</commit_message>
<xml_diff>
--- a/docs/preprints-org/PREPRINTS-manuscript.en.docx
+++ b/docs/preprints-org/PREPRINTS-manuscript.en.docx
@@ -2,7 +2,7 @@
 <file path=word/document.xml><?xml version="1.0" encoding="utf-8"?>
 <w:document xmlns:w="http://schemas.openxmlformats.org/wordprocessingml/2006/main" xmlns:m="http://schemas.openxmlformats.org/officeDocument/2006/math" xmlns:r="http://schemas.openxmlformats.org/officeDocument/2006/relationships" xmlns:o="urn:schemas-microsoft-com:office:office" xmlns:v="urn:schemas-microsoft-com:vml" xmlns:w10="urn:schemas-microsoft-com:office:word" xmlns:a="http://schemas.openxmlformats.org/drawingml/2006/main" xmlns:pic="http://schemas.openxmlformats.org/drawingml/2006/picture" xmlns:wp="http://schemas.openxmlformats.org/drawingml/2006/wordprocessingDrawing">
   <w:body>
-    <w:bookmarkStart w:id="64" w:name="X7f381bd97155403f83858e3081bab9ecb529ba8"/>
+    <w:bookmarkStart w:id="65" w:name="X7f381bd97155403f83858e3081bab9ecb529ba8"/>
     <w:p>
       <w:pPr>
         <w:pStyle w:val="Heading1"/>
@@ -258,7 +258,7 @@
       </w:r>
     </w:p>
     <w:bookmarkEnd w:id="21"/>
-    <w:bookmarkStart w:id="33" w:name="methods"/>
+    <w:bookmarkStart w:id="34" w:name="methods"/>
     <w:p>
       <w:pPr>
         <w:pStyle w:val="Heading2"/>
@@ -934,8 +934,26 @@
       </w:r>
     </w:p>
     <w:bookmarkEnd w:id="32"/>
+    <w:bookmarkStart w:id="33" w:name="use-of-ai-assisted-tools"/>
+    <w:p>
+      <w:pPr>
+        <w:pStyle w:val="Heading3"/>
+      </w:pPr>
+      <w:r>
+        <w:t xml:space="preserve">Use of AI-assisted tools</w:t>
+      </w:r>
+    </w:p>
+    <w:p>
+      <w:pPr>
+        <w:pStyle w:val="FirstParagraph"/>
+      </w:pPr>
+      <w:r>
+        <w:t xml:space="preserve">Claude (Anthropic) assisted in writing the instrument and grader code, generating the figures, and drafting and revising the text; Gemini 3.8 Flash (Google) reviewed the style and structure of the text. These assistants include versions of the model families evaluated. They took no part in running or grading the study: every call was executed and every response classified by deterministic code, and the author checked every number in the manuscript against the data.</w:t>
+      </w:r>
+    </w:p>
     <w:bookmarkEnd w:id="33"/>
-    <w:bookmarkStart w:id="56" w:name="results"/>
+    <w:bookmarkEnd w:id="34"/>
+    <w:bookmarkStart w:id="57" w:name="results"/>
     <w:p>
       <w:pPr>
         <w:pStyle w:val="Heading2"/>
@@ -944,7 +962,7 @@
         <w:t xml:space="preserve">Results</w:t>
       </w:r>
     </w:p>
-    <w:bookmarkStart w:id="34" w:name="sample"/>
+    <w:bookmarkStart w:id="35" w:name="sample"/>
     <w:p>
       <w:pPr>
         <w:pStyle w:val="Heading3"/>
@@ -997,8 +1015,8 @@
         <w:t xml:space="preserve">effort runs in the neutral excerpt condition. Three responses could not be parsed as JSON (two from DeepSeek V4.1 Flash and one from DeepSeek V4 Pro with reasoning off, all in the excerpt) and were excluded, leaving 3,019. No response contained a guess, that is, a new value with no basis in the material.</w:t>
       </w:r>
     </w:p>
-    <w:bookmarkEnd w:id="34"/>
-    <w:bookmarkStart w:id="38" w:name="Xd0e63049e6c20c15cae8abdefbc7905d131d860"/>
+    <w:bookmarkEnd w:id="35"/>
+    <w:bookmarkStart w:id="39" w:name="Xd0e63049e6c20c15cae8abdefbc7905d131d860"/>
     <w:p>
       <w:pPr>
         <w:pStyle w:val="Heading3"/>
@@ -1086,18 +1104,18 @@
           <wp:inline>
             <wp:extent cx="5334000" cy="2725987"/>
             <wp:effectExtent b="0" l="0" r="0" t="0"/>
-            <wp:docPr descr="Figure 2" title="" id="36" name="Picture"/>
+            <wp:docPr descr="Figure 2" title="" id="37" name="Picture"/>
             <a:graphic>
               <a:graphicData uri="http://schemas.openxmlformats.org/drawingml/2006/picture">
                 <pic:pic>
                   <pic:nvPicPr>
-                    <pic:cNvPr descr="figures/fig2-plausibility-flip.png" id="37" name="Picture"/>
+                    <pic:cNvPr descr="figures/fig2-plausibility-flip.png" id="38" name="Picture"/>
                     <pic:cNvPicPr>
                       <a:picLocks noChangeArrowheads="1" noChangeAspect="1"/>
                     </pic:cNvPicPr>
                   </pic:nvPicPr>
                   <pic:blipFill>
-                    <a:blip r:embed="rId35"/>
+                    <a:blip r:embed="rId36"/>
                     <a:stretch>
                       <a:fillRect/>
                     </a:stretch>
@@ -1174,8 +1192,8 @@
         <w:t xml:space="preserve">Excerpt, cells without proof, n = 36 per twin and model (34 for DeepSeek V4.1 Flash in the implausible twin). In the 12 models with reasoning, the points overlap at zero in panel A; in panel B, the only event is that of Claude Haiku 5.5 (1 of 36).</w:t>
       </w:r>
     </w:p>
-    <w:bookmarkEnd w:id="38"/>
-    <w:bookmarkStart w:id="39" w:name="behaviour-with-the-full-report"/>
+    <w:bookmarkEnd w:id="39"/>
+    <w:bookmarkStart w:id="40" w:name="behaviour-with-the-full-report"/>
     <w:p>
       <w:pPr>
         <w:pStyle w:val="Heading3"/>
@@ -1192,8 +1210,8 @@
         <w:t xml:space="preserve">With the full report, 11 of the 12 models with a reasoning parameter neither erased nor flipped any correct cell and corrected all 144 planted errors in 72 responses per model (four conditions). The exception was Claude Haiku 5.5 with reasoning off, which erased 10 correct cells (8 of them in the implausible twin, 8 of 60) and left 18 of the 144 planted errors uncorrected, 4 of them changed to another wrong value. Llama 4 Maverick left 3 errors uncorrected, in addition to the flips described above. Collateral edits were 0.2 per response or fewer in all models.</w:t>
       </w:r>
     </w:p>
-    <w:bookmarkEnd w:id="39"/>
-    <w:bookmarkStart w:id="46" w:name="X75522d972561de1de10451e442d10cd0c8727ad"/>
+    <w:bookmarkEnd w:id="40"/>
+    <w:bookmarkStart w:id="47" w:name="X75522d972561de1de10451e442d10cd0c8727ad"/>
     <w:p>
       <w:pPr>
         <w:pStyle w:val="Heading3"/>
@@ -1219,18 +1237,18 @@
           <wp:inline>
             <wp:extent cx="5334000" cy="3792787"/>
             <wp:effectExtent b="0" l="0" r="0" t="0"/>
-            <wp:docPr descr="Figure 3" title="" id="41" name="Picture"/>
+            <wp:docPr descr="Figure 3" title="" id="42" name="Picture"/>
             <a:graphic>
               <a:graphicData uri="http://schemas.openxmlformats.org/drawingml/2006/picture">
                 <pic:pic>
                   <pic:nvPicPr>
-                    <pic:cNvPr descr="figures/fig3-partial-evidence-outcomes.png" id="42" name="Picture"/>
+                    <pic:cNvPr descr="figures/fig3-partial-evidence-outcomes.png" id="43" name="Picture"/>
                     <pic:cNvPicPr>
                       <a:picLocks noChangeArrowheads="1" noChangeAspect="1"/>
                     </pic:cNvPicPr>
                   </pic:nvPicPr>
                   <pic:blipFill>
-                    <a:blip r:embed="rId40"/>
+                    <a:blip r:embed="rId41"/>
                     <a:stretch>
                       <a:fillRect/>
                     </a:stretch>
@@ -1322,18 +1340,18 @@
           <wp:inline>
             <wp:extent cx="4030699" cy="3321198"/>
             <wp:effectExtent b="0" l="0" r="0" t="0"/>
-            <wp:docPr descr="Figure 4" title="" id="44" name="Picture"/>
+            <wp:docPr descr="Figure 4" title="" id="45" name="Picture"/>
             <a:graphic>
               <a:graphicData uri="http://schemas.openxmlformats.org/drawingml/2006/picture">
                 <pic:pic>
                   <pic:nvPicPr>
-                    <pic:cNvPr descr="figures/fig4-collateral-edits.png" id="45" name="Picture"/>
+                    <pic:cNvPr descr="figures/fig4-collateral-edits.png" id="46" name="Picture"/>
                     <pic:cNvPicPr>
                       <a:picLocks noChangeArrowheads="1" noChangeAspect="1"/>
                     </pic:cNvPicPr>
                   </pic:nvPicPr>
                   <pic:blipFill>
-                    <a:blip r:embed="rId43"/>
+                    <a:blip r:embed="rId44"/>
                     <a:stretch>
                       <a:fillRect/>
                     </a:stretch>
@@ -1386,8 +1404,8 @@
         <w:t xml:space="preserve">The planted errors that remained verifiable in the excerpt were corrected by all models, with 1 miss in 108 in Claude Sonnet 5.5 and GPT-6 Luna and 2 in 108 in Claude Haiku 5.5 (Figure S1).</w:t>
       </w:r>
     </w:p>
-    <w:bookmarkEnd w:id="46"/>
-    <w:bookmarkStart w:id="47" w:name="symmetry-test"/>
+    <w:bookmarkEnd w:id="47"/>
+    <w:bookmarkStart w:id="48" w:name="symmetry-test"/>
     <w:p>
       <w:pPr>
         <w:pStyle w:val="Heading3"/>
@@ -1404,8 +1422,8 @@
         <w:t xml:space="preserve">The erasure rate of the same cell was equal or nearly equal in the two twins in all models (Figure 3): 27 and 27 in GPT-6.1 Sol and Sol Pro, 17 and 17 in Grok 4.7, 9 and 9 in Llama 4 Maverick, 8 and 9 in DeepSeek V4 Pro, 9 and 8 in Qwen 3.8 Max, 9 and 10 in Claude Haiku 5.5, 6 and 7 in Gemini 3.8 Flash. The largest difference was that of GPT-6 Luna, 27 against 21. No model consistently erased more in the implausible twin than in the plausible twin. The pattern of GPT-6.1 Sol illustrates the mechanism: the model erased the regional frequency, the paternal allele fraction, and the origin of the variant, whose proof sentences were outside the excerpt, and kept and flagged the registered sex, whose value was still printed in the header, although without explanation.</w:t>
       </w:r>
     </w:p>
-    <w:bookmarkEnd w:id="47"/>
-    <w:bookmarkStart w:id="51" w:name="effect-of-the-instruction"/>
+    <w:bookmarkEnd w:id="48"/>
+    <w:bookmarkStart w:id="52" w:name="effect-of-the-instruction"/>
     <w:p>
       <w:pPr>
         <w:pStyle w:val="Heading3"/>
@@ -1431,18 +1449,18 @@
           <wp:inline>
             <wp:extent cx="4030699" cy="3611727"/>
             <wp:effectExtent b="0" l="0" r="0" t="0"/>
-            <wp:docPr descr="Figure 5" title="" id="49" name="Picture"/>
+            <wp:docPr descr="Figure 5" title="" id="50" name="Picture"/>
             <a:graphic>
               <a:graphicData uri="http://schemas.openxmlformats.org/drawingml/2006/picture">
                 <pic:pic>
                   <pic:nvPicPr>
-                    <pic:cNvPr descr="figures/fig5-instruction-erasure.png" id="50" name="Picture"/>
+                    <pic:cNvPr descr="figures/fig5-instruction-erasure.png" id="51" name="Picture"/>
                     <pic:cNvPicPr>
                       <a:picLocks noChangeArrowheads="1" noChangeAspect="1"/>
                     </pic:cNvPicPr>
                   </pic:nvPicPr>
                   <pic:blipFill>
-                    <a:blip r:embed="rId48"/>
+                    <a:blip r:embed="rId49"/>
                     <a:stretch>
                       <a:fillRect/>
                     </a:stretch>
@@ -1487,8 +1505,8 @@
         <w:t xml:space="preserve">Correct cells without proof that were erased over the total of cells without proof, both twins combined (n = 24 per heat-map cell: 12 per twin, 9 responses per twin; 23 for DeepSeek V4.1 Flash in two conditions), excerpt with declared provenance, by condition. The headers separate the three conditions without a keep rule from the condition with it. Colour is proportional to the rate. Models in the order of Figure 3.</w:t>
       </w:r>
     </w:p>
-    <w:bookmarkEnd w:id="51"/>
-    <w:bookmarkStart w:id="55" w:name="effect-of-reasoning-effort"/>
+    <w:bookmarkEnd w:id="52"/>
+    <w:bookmarkStart w:id="56" w:name="effect-of-reasoning-effort"/>
     <w:p>
       <w:pPr>
         <w:pStyle w:val="Heading3"/>
@@ -1598,18 +1616,18 @@
           <wp:inline>
             <wp:extent cx="5334000" cy="3082424"/>
             <wp:effectExtent b="0" l="0" r="0" t="0"/>
-            <wp:docPr descr="Figure 6" title="" id="53" name="Picture"/>
+            <wp:docPr descr="Figure 6" title="" id="54" name="Picture"/>
             <a:graphic>
               <a:graphicData uri="http://schemas.openxmlformats.org/drawingml/2006/picture">
                 <pic:pic>
                   <pic:nvPicPr>
-                    <pic:cNvPr descr="figures/fig6-reasoning-effort.png" id="54" name="Picture"/>
+                    <pic:cNvPr descr="figures/fig6-reasoning-effort.png" id="55" name="Picture"/>
                     <pic:cNvPicPr>
                       <a:picLocks noChangeArrowheads="1" noChangeAspect="1"/>
                     </pic:cNvPicPr>
                   </pic:nvPicPr>
                   <pic:blipFill>
-                    <a:blip r:embed="rId52"/>
+                    <a:blip r:embed="rId53"/>
                     <a:stretch>
                       <a:fillRect/>
                     </a:stretch>
@@ -1830,9 +1848,9 @@
         <w:t xml:space="preserve">ratio.</w:t>
       </w:r>
     </w:p>
-    <w:bookmarkEnd w:id="55"/>
     <w:bookmarkEnd w:id="56"/>
-    <w:bookmarkStart w:id="57" w:name="discussion"/>
+    <w:bookmarkEnd w:id="57"/>
+    <w:bookmarkStart w:id="58" w:name="discussion"/>
     <w:p>
       <w:pPr>
         <w:pStyle w:val="Heading2"/>
@@ -1967,8 +1985,8 @@
         <w:t xml:space="preserve">In conclusion, with the proof in the material, language models with reasoning preserve correct values that look wrong. Without the proof, what distinguishes the models is whether they keep and flag or erase, and this difference is a behavioural default that an explicit keep instruction removes. Future studies should test the same design on other document types and with excerpt cuts of varying severity, to measure at what point the instruction is no longer enough.</w:t>
       </w:r>
     </w:p>
-    <w:bookmarkEnd w:id="57"/>
-    <w:bookmarkStart w:id="58" w:name="declarations"/>
+    <w:bookmarkEnd w:id="58"/>
+    <w:bookmarkStart w:id="59" w:name="declarations"/>
     <w:p>
       <w:pPr>
         <w:pStyle w:val="Heading2"/>
@@ -2121,8 +2139,8 @@
         <w:t xml:space="preserve">Claude (Anthropic) assisted in writing the code, generating the figures, and drafting and revising the text; Gemini 3.8 Flash (Google) reviewed style and structure. The models used as assistants include versions of the evaluated families. The author verified every number against the data and takes full responsibility for the content. The runs were executed and graded by deterministic code; no language model classified outcomes.</w:t>
       </w:r>
     </w:p>
-    <w:bookmarkEnd w:id="58"/>
-    <w:bookmarkStart w:id="59" w:name="references"/>
+    <w:bookmarkEnd w:id="59"/>
+    <w:bookmarkStart w:id="60" w:name="references"/>
     <w:p>
       <w:pPr>
         <w:pStyle w:val="Heading2"/>
@@ -2551,8 +2569,8 @@
         <w:t xml:space="preserve">Dratsch T, Chen X, Rezazade Mehrizi M, et al. Automation bias in mammography: the impact of artificial intelligence BI-RADS suggestions on reader performance. Radiology. 2023;307(4):e222176. doi:10.1148/radiol.222176</w:t>
       </w:r>
     </w:p>
-    <w:bookmarkEnd w:id="59"/>
-    <w:bookmarkStart w:id="63" w:name="supplementary-material"/>
+    <w:bookmarkEnd w:id="60"/>
+    <w:bookmarkStart w:id="64" w:name="supplementary-material"/>
     <w:p>
       <w:pPr>
         <w:pStyle w:val="Heading2"/>
@@ -2603,18 +2621,18 @@
           <wp:inline>
             <wp:extent cx="4550592" cy="3611727"/>
             <wp:effectExtent b="0" l="0" r="0" t="0"/>
-            <wp:docPr descr="Figure S1" title="" id="61" name="Picture"/>
+            <wp:docPr descr="Figure S1" title="" id="62" name="Picture"/>
             <a:graphic>
               <a:graphicData uri="http://schemas.openxmlformats.org/drawingml/2006/picture">
                 <pic:pic>
                   <pic:nvPicPr>
-                    <pic:cNvPr descr="figures/figS1-metric-summary.png" id="62" name="Picture"/>
+                    <pic:cNvPr descr="figures/figS1-metric-summary.png" id="63" name="Picture"/>
                     <pic:cNvPicPr>
                       <a:picLocks noChangeArrowheads="1" noChangeAspect="1"/>
                     </pic:cNvPicPr>
                   </pic:nvPicPr>
                   <pic:blipFill>
-                    <a:blip r:embed="rId60"/>
+                    <a:blip r:embed="rId61"/>
                     <a:stretch>
                       <a:fillRect/>
                     </a:stretch>
@@ -2716,8 +2734,8 @@
         <w:t xml:space="preserve">.</w:t>
       </w:r>
     </w:p>
-    <w:bookmarkEnd w:id="63"/>
     <w:bookmarkEnd w:id="64"/>
+    <w:bookmarkEnd w:id="65"/>
     <w:sectPr/>
   </w:body>
 </w:document>

</xml_diff>